<commit_message>
docs: v57 editada pelo autor - percentuais das seis linhas novas do Quadro 19
Co-Authored-By: Claude Opus 5.5 <noreply@anthropic.com>
</commit_message>
<xml_diff>
--- a/Transicao_pre-projeto-para-TCC-Completo_TCC_Iluminacao_SP_v57.docx
+++ b/Transicao_pre-projeto-para-TCC-Completo_TCC_Iluminacao_SP_v57.docx
@@ -611,19 +611,7 @@
         <w:rPr>
           <w:lang w:val="pt-BR"/>
         </w:rPr>
-        <w:t xml:space="preserve">São Paulo já dispõe de câmeras que observam o uso das vias e de luminárias cuja intensidade pode ser regulada remotamente, mas as duas infraestruturas não se comunicam. </w:t>
-      </w:r>
-      <w:r>
-        <w:rPr>
-          <w:lang w:val="pt-BR"/>
-        </w:rPr>
-        <w:t xml:space="preserve">Este trabalho propõe e demonstra, para a iluminação de vias de pedestres, a camada</w:t>
-      </w:r>
-      <w:r>
-        <w:rPr>
-          <w:lang w:val="pt-BR"/>
-        </w:rPr>
-        <w:t xml:space="preserve"> que as liga: um serviço em nuvem recebe, por interface REST, o volume de pessoas e as ocorrências de cada trecho de via, estima a demanda da próxima hora com um modelo de reforço de gradiente (XGBoost), decide o nível de iluminação por inferência nebulosa do tipo Mamdani e submete cada decisão a uma camada de verificação que impõe o piso e a taxa máxima de redução da ABNT NBR 5101 antes de qualquer comando. O comando chega por MQTT a um nó de bancada com ESP32, que ajusta uma fita de LED e devolve a iluminância medida. O sistema foi avaliado numa suíte de cenários, em noites reais de contagem de pedestres e na bancada, contra o fluxo pleno constante e a atenuação por horário fixo. Em 667.200 passos verificados não houve violação da norma, e a latência entre o evento e a medição foi de 1,03 s a 1,47 s. O regime adaptativo consumiu 24,3 % menos energia que o fluxo pleno na suíte e 37,6 % menos nas noites reais, sem deixar a via abaixo do nível exigido, o que a programação horária não assegurou. A previsão só superou referências simples com dados de 15 min, e a pertinência parcial mostrou-se substituível por tabela. Conclui-se que a integração é viável com a infraestrutura já contratada, desde que a plataforma publique os dados na interface especificada.</w:t>
+        <w:t>São Paulo já dispõe de câmeras que observam o uso das vias e de luminárias cuja intensidade pode ser regulada remotamente, mas as duas infraestruturas não se comunicam. Este trabalho propõe e demonstra, para a iluminação de vias de pedestres, a camada que as liga: um serviço em nuvem recebe, por interface REST, o volume de pessoas e as ocorrências de cada trecho de via, estima a demanda da próxima hora com um modelo de reforço de gradiente (XGBoost), decide o nível de iluminação por inferência nebulosa do tipo Mamdani e submete cada decisão a uma camada de verificação que impõe o piso e a taxa máxima de redução da ABNT NBR 5101 antes de qualquer comando. O comando chega por MQTT a um nó de bancada com ESP32, que ajusta uma fita de LED e devolve a iluminância medida. O sistema foi avaliado numa suíte de cenários, em noites reais de contagem de pedestres e na bancada, contra o fluxo pleno constante e a atenuação por horário fixo. Em 667.200 passos verificados não houve violação da norma, e a latência entre o evento e a medição foi de 1,03 s a 1,47 s. O regime adaptativo consumiu 24,3 % menos energia que o fluxo pleno na suíte e 37,6 % menos nas noites reais, sem deixar a via abaixo do nível exigido, o que a programação horária não assegurou. A previsão só superou referências simples com dados de 15 min, e a pertinência parcial mostrou-se substituível por tabela. Conclui-se que a integração é viável com a infraestrutura já contratada, desde que a plataforma publique os dados na interface especificada.</w:t>
       </w:r>
     </w:p>
     <w:p>
@@ -689,7 +677,7 @@
         <w:t xml:space="preserve">São Paulo already has cameras that observe how streets are used and streetlights whose intensity can be adjusted remotely, but the two infrastructures do not communicate. </w:t>
       </w:r>
       <w:r>
-        <w:t xml:space="preserve">This work proposes and demonstrates, for pedestrian street lighting, the layer</w:t>
+        <w:t>This work proposes and demonstrates, for pedestrian street lighting, the layer</w:t>
       </w:r>
       <w:r>
         <w:t xml:space="preserve"> that connects them: a cloud service receives, through a REST interface, the number of people and the incidents reported for each street segment, forecasts the demand for the next hour with a gradient boosting model (</w:t>
@@ -41319,7 +41307,7 @@
         <w:rPr>
           <w:lang w:val="pt-BR"/>
         </w:rPr>
-        <w:t xml:space="preserve">O objetivo geral foi atingido em pequena escala, para a classe de iluminação de pedestres adotada no trabalho (P3, com atenuação até P5): dados urbanos simulados a partir do que a plataforma de monitoramento já é obrigada a produzir foram transformados por inteligência artificial em decisões de iluminação executadas por um nó físico, sem nenhuma violação da ABNT NBR 5101 em 667.200 passos verificados e com latência de 1,03 s a 1,47 s, ainda sem integração efetiva com a plataforma. Os objetivos específicos foram atingidos: a base de regras foi construída com origem declarada, a interface de integração foi especificada, a previsão superou as referências de persistência e de média sazonal, o diagnóstico detectou a falha induzida, o nó voltou ao pleno sem comando e o consumo foi estimado sem medição elétrica. As hipóteses H1 e H2 foram aceitas e H3 foi rejeitada, pois a antecipação pela previsão aumentou o tempo em transição em vez de reduzi-lo. Ante o fluxo pleno, o sistema economizou 24,3 % na suíte de cenários e 37,6 % nas noites reais de Zurique; ante o horário fixo, gastou 6,7 % a mais na suíte e 21,4 % a menos nas noites reais, mas manteve o nível esperado em 98,2 % do tempo, contra 72,2 %. A previsão só se distinguiu das alternativas simples com dados de 15 min, e a inferência nebulosa foi igualada por uma tabela de regras. O ganho da proposta está, portanto, na luz adequada à situação com garantia normativa por construção, a partir de dados que o município já produz.</w:t>
+        <w:t>O objetivo geral foi atingido em pequena escala, para a classe de iluminação de pedestres adotada no trabalho (P3, com atenuação até P5): dados urbanos simulados a partir do que a plataforma de monitoramento já é obrigada a produzir foram transformados por inteligência artificial em decisões de iluminação executadas por um nó físico, sem nenhuma violação da ABNT NBR 5101 em 667.200 passos verificados e com latência de 1,03 s a 1,47 s, ainda sem integração efetiva com a plataforma. Os objetivos específicos foram atingidos: a base de regras foi construída com origem declarada, a interface de integração foi especificada, a previsão superou as referências de persistência e de média sazonal, o diagnóstico detectou a falha induzida, o nó voltou ao pleno sem comando e o consumo foi estimado sem medição elétrica. As hipóteses H1 e H2 foram aceitas e H3 foi rejeitada, pois a antecipação pela previsão aumentou o tempo em transição em vez de reduzi-lo. Ante o fluxo pleno, o sistema economizou 24,3 % na suíte de cenários e 37,6 % nas noites reais de Zurique; ante o horário fixo, gastou 6,7 % a mais na suíte e 21,4 % a menos nas noites reais, mas manteve o nível esperado em 98,2 % do tempo, contra 72,2 %. A previsão só se distinguiu das alternativas simples com dados de 15 min, e a inferência nebulosa foi igualada por uma tabela de regras. O ganho da proposta está, portanto, na luz adequada à situação com garantia normativa por construção, a partir de dados que o município já produz.</w:t>
       </w:r>
     </w:p>
     <w:p>
@@ -41412,7 +41400,6 @@
         <w:rPr>
           <w:lang w:val="pt-BR"/>
         </w:rPr>
-        <w:lastRenderedPageBreak/>
         <w:t>Estender a avaliação ao controle coordenado de múltiplas luminárias em rede (3.4.4 e 5.3).</w:t>
       </w:r>
     </w:p>
@@ -41433,6 +41420,7 @@
         <w:rPr>
           <w:lang w:val="pt-BR"/>
         </w:rPr>
+        <w:lastRenderedPageBreak/>
         <w:t>Estender o modelo a pontos de luz que atendem mais de uma classe — pista e calçada —, com o piso da classe mais exigente e com a movimentação de pedestres e de veículos (3.7 e 5.3).</w:t>
       </w:r>
     </w:p>
@@ -41445,12 +41433,15 @@
         </w:numPr>
         <w:spacing w:after="120" w:line="360" w:lineRule="auto"/>
         <w:jc w:val="both"/>
-      </w:pPr>
-      <w:r>
-        <w:rPr>
-          <w:lang w:val="pt-BR"/>
-        </w:rPr>
-        <w:t xml:space="preserve">Avaliar classes de via adicionais, além da classe de pedestres adotada (3.8 e 5.3).</w:t>
+        <w:rPr>
+          <w:lang w:val="pt-BR"/>
+        </w:rPr>
+      </w:pPr>
+      <w:r>
+        <w:rPr>
+          <w:lang w:val="pt-BR"/>
+        </w:rPr>
+        <w:t>Avaliar classes de via adicionais, além da classe de pedestres adotada (3.8 e 5.3).</w:t>
       </w:r>
     </w:p>
     <w:p>
@@ -41462,12 +41453,15 @@
         </w:numPr>
         <w:spacing w:after="120" w:line="360" w:lineRule="auto"/>
         <w:jc w:val="both"/>
-      </w:pPr>
-      <w:r>
-        <w:rPr>
-          <w:lang w:val="pt-BR"/>
-        </w:rPr>
-        <w:t xml:space="preserve">Incorporar dados meteorológicos como terceira restrição da camada de verificação, atendendo à recomendação da subseção 6.10 da ABNT NBR 5101 (5.3).</w:t>
+        <w:rPr>
+          <w:lang w:val="pt-BR"/>
+        </w:rPr>
+      </w:pPr>
+      <w:r>
+        <w:rPr>
+          <w:lang w:val="pt-BR"/>
+        </w:rPr>
+        <w:t>Incorporar dados meteorológicos como terceira restrição da camada de verificação, atendendo à recomendação da subseção 6.10 da ABNT NBR 5101 (5.3).</w:t>
       </w:r>
     </w:p>
     <w:p>
@@ -41479,12 +41473,15 @@
         </w:numPr>
         <w:spacing w:after="120" w:line="360" w:lineRule="auto"/>
         <w:jc w:val="both"/>
-      </w:pPr>
-      <w:r>
-        <w:rPr>
-          <w:lang w:val="pt-BR"/>
-        </w:rPr>
-        <w:t xml:space="preserve">Acrescentar variáveis de entrada, como o nível de confiança da contagem e a presença simultânea de pedestres e veículos, e verificar se a inferência nebulosa passa a superar a tabela de regras (4.6 e 5.3).</w:t>
+        <w:rPr>
+          <w:lang w:val="pt-BR"/>
+        </w:rPr>
+      </w:pPr>
+      <w:r>
+        <w:rPr>
+          <w:lang w:val="pt-BR"/>
+        </w:rPr>
+        <w:t>Acrescentar variáveis de entrada, como o nível de confiança da contagem e a presença simultânea de pedestres e veículos, e verificar se a inferência nebulosa passa a superar a tabela de regras (4.6 e 5.3).</w:t>
       </w:r>
     </w:p>
     <w:p>
@@ -41644,6 +41641,7 @@
         <w:rPr>
           <w:lang w:val="pt-BR"/>
         </w:rPr>
+        <w:lastRenderedPageBreak/>
         <w:t>Implantar a arquitetura de referência para operação em escala, com teste de carga, de falha de componente e de recuperação, e confirmar o custo estimado no Apêndice D (3.12.6.4 e 5.3).</w:t>
       </w:r>
     </w:p>
@@ -43352,12 +43350,22 @@
       <w:pPr>
         <w:spacing w:after="120" w:line="360" w:lineRule="auto"/>
         <w:jc w:val="both"/>
-      </w:pPr>
-      <w:r>
-        <w:rPr>
-          <w:lang w:val="pt-BR"/>
-        </w:rPr>
-        <w:t xml:space="preserve">Na última coluna do Quadro 19, o percentual indica a parcela do resultado gerado pela ferramenta que foi conferida, alterada ou refeita manualmente pelos autores antes de integrar o trabalho, e a descrição que o acompanha indica a forma dessa intervenção: conferência contra o protótipo, os dados ou as fontes, correção, reescrita ou rejeição.</w:t>
+        <w:rPr>
+          <w:lang w:val="pt-BR"/>
+        </w:rPr>
+      </w:pPr>
+      <w:r>
+        <w:rPr>
+          <w:lang w:val="pt-BR"/>
+        </w:rPr>
+        <w:t xml:space="preserve">Na última coluna do Quadro 19, o percentual indica a parcela do resultado gerado pela ferramenta que foi conferida, alterada ou refeita manualmente pelos autores antes de </w:t>
+      </w:r>
+      <w:r>
+        <w:rPr>
+          <w:lang w:val="pt-BR"/>
+        </w:rPr>
+        <w:lastRenderedPageBreak/>
+        <w:t>integrar o trabalho, e a descrição que o acompanha indica a forma dessa intervenção: conferência contra o protótipo, os dados ou as fontes, correção, reescrita ou rejeição.</w:t>
       </w:r>
     </w:p>
     <w:p>
@@ -43375,7 +43383,6 @@
           <w:szCs w:val="20"/>
           <w:lang w:val="pt-BR"/>
         </w:rPr>
-        <w:lastRenderedPageBreak/>
         <w:t xml:space="preserve">Quadro </w:t>
       </w:r>
       <w:r>
@@ -43447,11 +43454,11 @@
         <w:tblLook w:val="04A0" w:firstRow="1" w:lastRow="0" w:firstColumn="1" w:lastColumn="0" w:noHBand="0" w:noVBand="1"/>
       </w:tblPr>
       <w:tblGrid>
-        <w:gridCol w:w="1693"/>
-        <w:gridCol w:w="1435"/>
-        <w:gridCol w:w="1626"/>
-        <w:gridCol w:w="2672"/>
-        <w:gridCol w:w="1645"/>
+        <w:gridCol w:w="1687"/>
+        <w:gridCol w:w="1423"/>
+        <w:gridCol w:w="1599"/>
+        <w:gridCol w:w="2603"/>
+        <w:gridCol w:w="1759"/>
       </w:tblGrid>
       <w:tr>
         <w:trPr>
@@ -43920,15 +43927,7 @@
                 <w:szCs w:val="20"/>
                 <w:lang w:val="pt-BR"/>
               </w:rPr>
-              <w:t xml:space="preserve">Geração dos diagramas de casos de uso, de arquitetura,</w:t>
-            </w:r>
-            <w:r>
-              <w:rPr>
-                <w:sz w:val="20"/>
-                <w:szCs w:val="20"/>
-                <w:lang w:val="pt-BR"/>
-              </w:rPr>
-              <w:t xml:space="preserve"> de sequência e de entidade-relacionamento por script Python, a partir da especificação definida pelos autores</w:t>
+              <w:t>Geração dos diagramas de casos de uso, de arquitetura, de sequência e de entidade-relacionamento por script Python, a partir da especificação definida pelos autores</w:t>
             </w:r>
           </w:p>
         </w:tc>
@@ -44105,7 +44104,6 @@
         </w:tc>
       </w:tr>
       <w:tr>
-        <w:trPr/>
         <w:tc>
           <w:tcPr>
             <w:tcW w:w="1693" w:type="dxa"/>
@@ -44117,13 +44115,12 @@
             </w:tcMar>
           </w:tcPr>
           <w:p>
-            <w:pPr/>
-            <w:r>
-              <w:rPr>
-                <w:sz w:val="20"/>
-                <w:szCs w:val="20"/>
-              </w:rPr>
-              <w:t xml:space="preserve">Claude Opus 5 e Claude Opus 5.5 (Anthropic)</w:t>
+            <w:r>
+              <w:rPr>
+                <w:sz w:val="20"/>
+                <w:szCs w:val="20"/>
+              </w:rPr>
+              <w:t>Claude Opus 5 e Claude Opus 5.5 (Anthropic)</w:t>
             </w:r>
           </w:p>
         </w:tc>
@@ -44138,14 +44135,18 @@
             </w:tcMar>
           </w:tcPr>
           <w:p>
-            <w:pPr/>
-            <w:r>
-              <w:rPr>
-                <w:sz w:val="20"/>
-                <w:szCs w:val="20"/>
-                <w:lang w:val="pt-BR"/>
-              </w:rPr>
-              <w:t xml:space="preserve">claude-opus-5 e claude-opus-5-5, pela ferramenta Claude Code</w:t>
+            <w:pPr>
+              <w:rPr>
+                <w:lang w:val="pt-BR"/>
+              </w:rPr>
+            </w:pPr>
+            <w:r>
+              <w:rPr>
+                <w:sz w:val="20"/>
+                <w:szCs w:val="20"/>
+                <w:lang w:val="pt-BR"/>
+              </w:rPr>
+              <w:t>claude-opus-5 e claude-opus-5-5, pela ferramenta Claude Code</w:t>
             </w:r>
           </w:p>
         </w:tc>
@@ -44160,14 +44161,13 @@
             </w:tcMar>
           </w:tcPr>
           <w:p>
-            <w:pPr/>
-            <w:r>
-              <w:rPr>
-                <w:sz w:val="20"/>
-                <w:szCs w:val="20"/>
-                <w:lang w:val="pt-BR"/>
-              </w:rPr>
-              <w:t xml:space="preserve">Capítulo 2</w:t>
+            <w:r>
+              <w:rPr>
+                <w:sz w:val="20"/>
+                <w:szCs w:val="20"/>
+                <w:lang w:val="pt-BR"/>
+              </w:rPr>
+              <w:t>Capítulo 2</w:t>
             </w:r>
           </w:p>
         </w:tc>
@@ -44182,14 +44182,18 @@
             </w:tcMar>
           </w:tcPr>
           <w:p>
-            <w:pPr/>
-            <w:r>
-              <w:rPr>
-                <w:sz w:val="20"/>
-                <w:szCs w:val="20"/>
-                <w:lang w:val="pt-BR"/>
-              </w:rPr>
-              <w:t xml:space="preserve">Redação de trechos da revisão bibliográfica a partir de fontes lidas e selecionadas pelos autores</w:t>
+            <w:pPr>
+              <w:rPr>
+                <w:lang w:val="pt-BR"/>
+              </w:rPr>
+            </w:pPr>
+            <w:r>
+              <w:rPr>
+                <w:sz w:val="20"/>
+                <w:szCs w:val="20"/>
+                <w:lang w:val="pt-BR"/>
+              </w:rPr>
+              <w:t>Redação de trechos da revisão bibliográfica a partir de fontes lidas e selecionadas pelos autores</w:t>
             </w:r>
           </w:p>
         </w:tc>
@@ -44204,14 +44208,34 @@
             </w:tcMar>
           </w:tcPr>
           <w:p>
-            <w:pPr/>
-            <w:r>
-              <w:rPr>
-                <w:sz w:val="20"/>
-                <w:szCs w:val="20"/>
-                <w:lang w:val="pt-BR"/>
-              </w:rPr>
-              <w:t xml:space="preserve"/>
+            <w:pPr>
+              <w:rPr>
+                <w:lang w:val="pt-BR"/>
+              </w:rPr>
+            </w:pPr>
+            <w:r>
+              <w:rPr>
+                <w:sz w:val="20"/>
+                <w:szCs w:val="20"/>
+                <w:lang w:val="pt-BR"/>
+              </w:rPr>
+              <w:t xml:space="preserve">100% </w:t>
+            </w:r>
+            <w:r>
+              <w:rPr>
+                <w:sz w:val="20"/>
+                <w:szCs w:val="20"/>
+                <w:lang w:val="pt-BR"/>
+              </w:rPr>
+              <w:t>—</w:t>
+            </w:r>
+            <w:r>
+              <w:rPr>
+                <w:sz w:val="20"/>
+                <w:szCs w:val="20"/>
+                <w:lang w:val="pt-BR"/>
+              </w:rPr>
+              <w:t xml:space="preserve"> fontes lidas pelos autores; trechos conferidos contra os artigos originais e reescritos onde não correspondiam</w:t>
             </w:r>
           </w:p>
         </w:tc>
@@ -44331,15 +44355,24 @@
                 <w:szCs w:val="20"/>
                 <w:lang w:val="pt-BR"/>
               </w:rPr>
-              <w:t xml:space="preserve">100% —</w:t>
-            </w:r>
-            <w:r>
-              <w:rPr>
-                <w:sz w:val="20"/>
-                <w:szCs w:val="20"/>
-                <w:lang w:val="pt-BR"/>
-              </w:rPr>
-              <w:t xml:space="preserve"> valores citados conferidos pelos autores nos documentos originais (contrato, Caderno de Encargos, GeoSampa)</w:t>
+              <w:t>100% —</w:t>
+            </w:r>
+            <w:r>
+              <w:rPr>
+                <w:sz w:val="20"/>
+                <w:szCs w:val="20"/>
+                <w:lang w:val="pt-BR"/>
+              </w:rPr>
+              <w:t xml:space="preserve"> valores citados conferidos pelos autores nos documentos originais (contrato, Caderno de </w:t>
+            </w:r>
+            <w:r>
+              <w:rPr>
+                <w:sz w:val="20"/>
+                <w:szCs w:val="20"/>
+                <w:lang w:val="pt-BR"/>
+              </w:rPr>
+              <w:lastRenderedPageBreak/>
+              <w:t>Encargos, GeoSampa)</w:t>
             </w:r>
           </w:p>
         </w:tc>
@@ -44361,6 +44394,7 @@
                 <w:sz w:val="20"/>
                 <w:szCs w:val="20"/>
               </w:rPr>
+              <w:lastRenderedPageBreak/>
               <w:t>Claude Opus 5 e Claude Opus 5.5 (Anthropic)</w:t>
             </w:r>
           </w:p>
@@ -44476,16 +44510,7 @@
                 <w:szCs w:val="20"/>
                 <w:lang w:val="pt-BR"/>
               </w:rPr>
-              <w:t xml:space="preserve"> — conteúdo, decisões e roteiro definidos pelos autores; cada versão revisada em controle de alterações, com trechos </w:t>
-            </w:r>
-            <w:r>
-              <w:rPr>
-                <w:sz w:val="20"/>
-                <w:szCs w:val="20"/>
-                <w:lang w:val="pt-BR"/>
-              </w:rPr>
-              <w:lastRenderedPageBreak/>
-              <w:t>reescritos ou rejeitados</w:t>
+              <w:t xml:space="preserve"> — conteúdo, decisões e roteiro definidos pelos autores; cada versão revisada em controle de alterações, com trechos reescritos ou rejeitados</w:t>
             </w:r>
           </w:p>
         </w:tc>
@@ -44507,6 +44532,605 @@
                 <w:sz w:val="20"/>
                 <w:szCs w:val="20"/>
               </w:rPr>
+              <w:t>Claude Opus 5 e Claude Opus 5.5 (Anthropic)</w:t>
+            </w:r>
+          </w:p>
+        </w:tc>
+        <w:tc>
+          <w:tcPr>
+            <w:tcW w:w="1435" w:type="dxa"/>
+            <w:tcMar>
+              <w:top w:w="70" w:type="dxa"/>
+              <w:left w:w="90" w:type="dxa"/>
+              <w:bottom w:w="70" w:type="dxa"/>
+              <w:right w:w="90" w:type="dxa"/>
+            </w:tcMar>
+          </w:tcPr>
+          <w:p>
+            <w:pPr>
+              <w:rPr>
+                <w:lang w:val="pt-BR"/>
+              </w:rPr>
+            </w:pPr>
+            <w:r>
+              <w:rPr>
+                <w:sz w:val="20"/>
+                <w:szCs w:val="20"/>
+                <w:lang w:val="pt-BR"/>
+              </w:rPr>
+              <w:t>claude-opus-5 e claude-opus-5-5, pela ferramenta Claude Code</w:t>
+            </w:r>
+          </w:p>
+        </w:tc>
+        <w:tc>
+          <w:tcPr>
+            <w:tcW w:w="1626" w:type="dxa"/>
+            <w:tcMar>
+              <w:top w:w="70" w:type="dxa"/>
+              <w:left w:w="90" w:type="dxa"/>
+              <w:bottom w:w="70" w:type="dxa"/>
+              <w:right w:w="90" w:type="dxa"/>
+            </w:tcMar>
+          </w:tcPr>
+          <w:p>
+            <w:pPr>
+              <w:rPr>
+                <w:lang w:val="pt-BR"/>
+              </w:rPr>
+            </w:pPr>
+            <w:r>
+              <w:rPr>
+                <w:sz w:val="20"/>
+                <w:szCs w:val="20"/>
+                <w:lang w:val="pt-BR"/>
+              </w:rPr>
+              <w:t>Protótipo (repositório de código), 3.12 e 3.13</w:t>
+            </w:r>
+          </w:p>
+        </w:tc>
+        <w:tc>
+          <w:tcPr>
+            <w:tcW w:w="2672" w:type="dxa"/>
+            <w:tcMar>
+              <w:top w:w="70" w:type="dxa"/>
+              <w:left w:w="90" w:type="dxa"/>
+              <w:bottom w:w="70" w:type="dxa"/>
+              <w:right w:w="90" w:type="dxa"/>
+            </w:tcMar>
+          </w:tcPr>
+          <w:p>
+            <w:pPr>
+              <w:rPr>
+                <w:lang w:val="pt-BR"/>
+              </w:rPr>
+            </w:pPr>
+            <w:r>
+              <w:rPr>
+                <w:sz w:val="20"/>
+                <w:szCs w:val="20"/>
+                <w:lang w:val="pt-BR"/>
+              </w:rPr>
+              <w:t>Programação assistida do protótipo — serviço de decisão, interface de dados, banco, painel, firmware e testes automatizados —, sobre requisitos, arquitetura e decisões definidos pelos autores</w:t>
+            </w:r>
+          </w:p>
+        </w:tc>
+        <w:tc>
+          <w:tcPr>
+            <w:tcW w:w="1645" w:type="dxa"/>
+            <w:tcMar>
+              <w:top w:w="70" w:type="dxa"/>
+              <w:left w:w="90" w:type="dxa"/>
+              <w:bottom w:w="70" w:type="dxa"/>
+              <w:right w:w="90" w:type="dxa"/>
+            </w:tcMar>
+          </w:tcPr>
+          <w:p>
+            <w:pPr>
+              <w:rPr>
+                <w:lang w:val="pt-BR"/>
+              </w:rPr>
+            </w:pPr>
+            <w:r>
+              <w:rPr>
+                <w:sz w:val="20"/>
+                <w:szCs w:val="20"/>
+                <w:lang w:val="pt-BR"/>
+              </w:rPr>
+              <w:t>70%</w:t>
+            </w:r>
+            <w:r>
+              <w:rPr>
+                <w:sz w:val="20"/>
+                <w:szCs w:val="20"/>
+                <w:lang w:val="pt-BR"/>
+              </w:rPr>
+              <w:t xml:space="preserve"> — requisitos e arquitetura dos autores; código revisado e testado em bancada pelos autores, com montagem física e gravação do firmware feitas por eles</w:t>
+            </w:r>
+          </w:p>
+        </w:tc>
+      </w:tr>
+      <w:tr>
+        <w:tc>
+          <w:tcPr>
+            <w:tcW w:w="1693" w:type="dxa"/>
+            <w:tcMar>
+              <w:top w:w="70" w:type="dxa"/>
+              <w:left w:w="90" w:type="dxa"/>
+              <w:bottom w:w="70" w:type="dxa"/>
+              <w:right w:w="90" w:type="dxa"/>
+            </w:tcMar>
+          </w:tcPr>
+          <w:p>
+            <w:r>
+              <w:rPr>
+                <w:sz w:val="20"/>
+                <w:szCs w:val="20"/>
+              </w:rPr>
+              <w:t>Claude Opus 5 e Claude Opus 5.5 (Anthropic)</w:t>
+            </w:r>
+          </w:p>
+        </w:tc>
+        <w:tc>
+          <w:tcPr>
+            <w:tcW w:w="1435" w:type="dxa"/>
+            <w:tcMar>
+              <w:top w:w="70" w:type="dxa"/>
+              <w:left w:w="90" w:type="dxa"/>
+              <w:bottom w:w="70" w:type="dxa"/>
+              <w:right w:w="90" w:type="dxa"/>
+            </w:tcMar>
+          </w:tcPr>
+          <w:p>
+            <w:pPr>
+              <w:rPr>
+                <w:lang w:val="pt-BR"/>
+              </w:rPr>
+            </w:pPr>
+            <w:r>
+              <w:rPr>
+                <w:sz w:val="20"/>
+                <w:szCs w:val="20"/>
+                <w:lang w:val="pt-BR"/>
+              </w:rPr>
+              <w:t>claude-opus-5 e claude-opus-5-5, pela ferramenta Claude Code</w:t>
+            </w:r>
+          </w:p>
+        </w:tc>
+        <w:tc>
+          <w:tcPr>
+            <w:tcW w:w="1626" w:type="dxa"/>
+            <w:tcMar>
+              <w:top w:w="70" w:type="dxa"/>
+              <w:left w:w="90" w:type="dxa"/>
+              <w:bottom w:w="70" w:type="dxa"/>
+              <w:right w:w="90" w:type="dxa"/>
+            </w:tcMar>
+          </w:tcPr>
+          <w:p>
+            <w:r>
+              <w:rPr>
+                <w:sz w:val="20"/>
+                <w:szCs w:val="20"/>
+              </w:rPr>
+              <w:t xml:space="preserve">3.6, 3.9, 4.1, 4.6 e </w:t>
+            </w:r>
+            <w:proofErr w:type="spellStart"/>
+            <w:r>
+              <w:rPr>
+                <w:sz w:val="20"/>
+                <w:szCs w:val="20"/>
+              </w:rPr>
+              <w:t>Apêndice</w:t>
+            </w:r>
+            <w:proofErr w:type="spellEnd"/>
+            <w:r>
+              <w:rPr>
+                <w:sz w:val="20"/>
+                <w:szCs w:val="20"/>
+              </w:rPr>
+              <w:t xml:space="preserve"> B</w:t>
+            </w:r>
+          </w:p>
+        </w:tc>
+        <w:tc>
+          <w:tcPr>
+            <w:tcW w:w="2672" w:type="dxa"/>
+            <w:tcMar>
+              <w:top w:w="70" w:type="dxa"/>
+              <w:left w:w="90" w:type="dxa"/>
+              <w:bottom w:w="70" w:type="dxa"/>
+              <w:right w:w="90" w:type="dxa"/>
+            </w:tcMar>
+          </w:tcPr>
+          <w:p>
+            <w:pPr>
+              <w:rPr>
+                <w:lang w:val="pt-BR"/>
+              </w:rPr>
+            </w:pPr>
+            <w:r>
+              <w:rPr>
+                <w:sz w:val="20"/>
+                <w:szCs w:val="20"/>
+                <w:lang w:val="pt-BR"/>
+              </w:rPr>
+              <w:t>Elaboração dos protocolos e dos programas de avaliação, execução dos experimentos e tabulação dos resultados, com os critérios discutidos e aprovados pelos autores antes de cada execução; busca e conferência de qualidade dos conjuntos de dados públicos</w:t>
+            </w:r>
+          </w:p>
+        </w:tc>
+        <w:tc>
+          <w:tcPr>
+            <w:tcW w:w="1645" w:type="dxa"/>
+            <w:tcMar>
+              <w:top w:w="70" w:type="dxa"/>
+              <w:left w:w="90" w:type="dxa"/>
+              <w:bottom w:w="70" w:type="dxa"/>
+              <w:right w:w="90" w:type="dxa"/>
+            </w:tcMar>
+          </w:tcPr>
+          <w:p>
+            <w:pPr>
+              <w:rPr>
+                <w:lang w:val="pt-BR"/>
+              </w:rPr>
+            </w:pPr>
+            <w:r>
+              <w:rPr>
+                <w:sz w:val="20"/>
+                <w:szCs w:val="20"/>
+                <w:lang w:val="pt-BR"/>
+              </w:rPr>
+              <w:t>80%</w:t>
+            </w:r>
+            <w:r>
+              <w:rPr>
+                <w:sz w:val="20"/>
+                <w:szCs w:val="20"/>
+                <w:lang w:val="pt-BR"/>
+              </w:rPr>
+              <w:t xml:space="preserve"> — critérios discutidos e aprovados pelos autores antes de cada execução; resultados reinterpretados por eles (ex.: H3 rejeitada, troca para </w:t>
+            </w:r>
+            <w:r>
+              <w:rPr>
+                <w:sz w:val="20"/>
+                <w:szCs w:val="20"/>
+                <w:lang w:val="pt-BR"/>
+              </w:rPr>
+              <w:t>Zurique)</w:t>
+            </w:r>
+          </w:p>
+        </w:tc>
+      </w:tr>
+      <w:tr>
+        <w:tc>
+          <w:tcPr>
+            <w:tcW w:w="1693" w:type="dxa"/>
+            <w:tcMar>
+              <w:top w:w="70" w:type="dxa"/>
+              <w:left w:w="90" w:type="dxa"/>
+              <w:bottom w:w="70" w:type="dxa"/>
+              <w:right w:w="90" w:type="dxa"/>
+            </w:tcMar>
+          </w:tcPr>
+          <w:p>
+            <w:r>
+              <w:rPr>
+                <w:sz w:val="20"/>
+                <w:szCs w:val="20"/>
+              </w:rPr>
+              <w:t>Claude Opus 5 e Claude Opus 5.5 (Anthropic)</w:t>
+            </w:r>
+          </w:p>
+        </w:tc>
+        <w:tc>
+          <w:tcPr>
+            <w:tcW w:w="1435" w:type="dxa"/>
+            <w:tcMar>
+              <w:top w:w="70" w:type="dxa"/>
+              <w:left w:w="90" w:type="dxa"/>
+              <w:bottom w:w="70" w:type="dxa"/>
+              <w:right w:w="90" w:type="dxa"/>
+            </w:tcMar>
+          </w:tcPr>
+          <w:p>
+            <w:pPr>
+              <w:rPr>
+                <w:lang w:val="pt-BR"/>
+              </w:rPr>
+            </w:pPr>
+            <w:r>
+              <w:rPr>
+                <w:sz w:val="20"/>
+                <w:szCs w:val="20"/>
+                <w:lang w:val="pt-BR"/>
+              </w:rPr>
+              <w:t>claude-opus-5 e claude-opus-5-5, pela ferramenta Claude Code</w:t>
+            </w:r>
+          </w:p>
+        </w:tc>
+        <w:tc>
+          <w:tcPr>
+            <w:tcW w:w="1626" w:type="dxa"/>
+            <w:tcMar>
+              <w:top w:w="70" w:type="dxa"/>
+              <w:left w:w="90" w:type="dxa"/>
+              <w:bottom w:w="70" w:type="dxa"/>
+              <w:right w:w="90" w:type="dxa"/>
+            </w:tcMar>
+          </w:tcPr>
+          <w:p>
+            <w:r>
+              <w:rPr>
+                <w:sz w:val="20"/>
+                <w:szCs w:val="20"/>
+                <w:lang w:val="pt-BR"/>
+              </w:rPr>
+              <w:t>3.12.1, 3.12.2, 3.12.5 e 3.12.8</w:t>
+            </w:r>
+          </w:p>
+        </w:tc>
+        <w:tc>
+          <w:tcPr>
+            <w:tcW w:w="2672" w:type="dxa"/>
+            <w:tcMar>
+              <w:top w:w="70" w:type="dxa"/>
+              <w:left w:w="90" w:type="dxa"/>
+              <w:bottom w:w="70" w:type="dxa"/>
+              <w:right w:w="90" w:type="dxa"/>
+            </w:tcMar>
+          </w:tcPr>
+          <w:p>
+            <w:pPr>
+              <w:rPr>
+                <w:lang w:val="pt-BR"/>
+              </w:rPr>
+            </w:pPr>
+            <w:r>
+              <w:rPr>
+                <w:sz w:val="20"/>
+                <w:szCs w:val="20"/>
+                <w:lang w:val="pt-BR"/>
+              </w:rPr>
+              <w:t>Redação a partir de informações fornecidas pelos autores: partes interessadas, processo e divisão do trabalho, casos de uso e cronograma pelo histórico de versões do repositório</w:t>
+            </w:r>
+          </w:p>
+        </w:tc>
+        <w:tc>
+          <w:tcPr>
+            <w:tcW w:w="1645" w:type="dxa"/>
+            <w:tcMar>
+              <w:top w:w="70" w:type="dxa"/>
+              <w:left w:w="90" w:type="dxa"/>
+              <w:bottom w:w="70" w:type="dxa"/>
+              <w:right w:w="90" w:type="dxa"/>
+            </w:tcMar>
+          </w:tcPr>
+          <w:p>
+            <w:pPr>
+              <w:rPr>
+                <w:lang w:val="pt-BR"/>
+              </w:rPr>
+            </w:pPr>
+            <w:r>
+              <w:rPr>
+                <w:sz w:val="20"/>
+                <w:szCs w:val="20"/>
+                <w:lang w:val="pt-BR"/>
+              </w:rPr>
+              <w:t xml:space="preserve">100% </w:t>
+            </w:r>
+            <w:r>
+              <w:rPr>
+                <w:sz w:val="20"/>
+                <w:szCs w:val="20"/>
+                <w:lang w:val="pt-BR"/>
+              </w:rPr>
+              <w:t>—</w:t>
+            </w:r>
+            <w:r>
+              <w:rPr>
+                <w:lang w:val="pt-BR"/>
+              </w:rPr>
+              <w:t xml:space="preserve"> </w:t>
+            </w:r>
+            <w:r>
+              <w:rPr>
+                <w:sz w:val="20"/>
+                <w:szCs w:val="20"/>
+                <w:lang w:val="pt-BR"/>
+              </w:rPr>
+              <w:t>conteúdo fornecido pelos autores (partes interessadas, divisão do trabalho, datas); texto conferido contra o histórico do repositório</w:t>
+            </w:r>
+          </w:p>
+        </w:tc>
+      </w:tr>
+      <w:tr>
+        <w:tc>
+          <w:tcPr>
+            <w:tcW w:w="1693" w:type="dxa"/>
+            <w:tcMar>
+              <w:top w:w="70" w:type="dxa"/>
+              <w:left w:w="90" w:type="dxa"/>
+              <w:bottom w:w="70" w:type="dxa"/>
+              <w:right w:w="90" w:type="dxa"/>
+            </w:tcMar>
+          </w:tcPr>
+          <w:p>
+            <w:r>
+              <w:rPr>
+                <w:sz w:val="20"/>
+                <w:szCs w:val="20"/>
+              </w:rPr>
+              <w:t>Claude Opus 5 e Claude Opus 5.5 (Anthropic)</w:t>
+            </w:r>
+          </w:p>
+        </w:tc>
+        <w:tc>
+          <w:tcPr>
+            <w:tcW w:w="1435" w:type="dxa"/>
+            <w:tcMar>
+              <w:top w:w="70" w:type="dxa"/>
+              <w:left w:w="90" w:type="dxa"/>
+              <w:bottom w:w="70" w:type="dxa"/>
+              <w:right w:w="90" w:type="dxa"/>
+            </w:tcMar>
+          </w:tcPr>
+          <w:p>
+            <w:pPr>
+              <w:rPr>
+                <w:lang w:val="pt-BR"/>
+              </w:rPr>
+            </w:pPr>
+            <w:r>
+              <w:rPr>
+                <w:sz w:val="20"/>
+                <w:szCs w:val="20"/>
+                <w:lang w:val="pt-BR"/>
+              </w:rPr>
+              <w:t>claude-opus-5 e claude-opus-5-5, pela ferramenta Claude Code</w:t>
+            </w:r>
+          </w:p>
+        </w:tc>
+        <w:tc>
+          <w:tcPr>
+            <w:tcW w:w="1626" w:type="dxa"/>
+            <w:tcMar>
+              <w:top w:w="70" w:type="dxa"/>
+              <w:left w:w="90" w:type="dxa"/>
+              <w:bottom w:w="70" w:type="dxa"/>
+              <w:right w:w="90" w:type="dxa"/>
+            </w:tcMar>
+          </w:tcPr>
+          <w:p>
+            <w:r>
+              <w:rPr>
+                <w:sz w:val="20"/>
+                <w:szCs w:val="20"/>
+                <w:lang w:val="pt-BR"/>
+              </w:rPr>
+              <w:t>3.12.6.4 e Apêndice D</w:t>
+            </w:r>
+          </w:p>
+        </w:tc>
+        <w:tc>
+          <w:tcPr>
+            <w:tcW w:w="2672" w:type="dxa"/>
+            <w:tcMar>
+              <w:top w:w="70" w:type="dxa"/>
+              <w:left w:w="90" w:type="dxa"/>
+              <w:bottom w:w="70" w:type="dxa"/>
+              <w:right w:w="90" w:type="dxa"/>
+            </w:tcMar>
+          </w:tcPr>
+          <w:p>
+            <w:pPr>
+              <w:rPr>
+                <w:lang w:val="pt-BR"/>
+              </w:rPr>
+            </w:pPr>
+            <w:r>
+              <w:rPr>
+                <w:sz w:val="20"/>
+                <w:szCs w:val="20"/>
+                <w:lang w:val="pt-BR"/>
+              </w:rPr>
+              <w:t>Proposta de arquitetura de referência e estimativa de custo elaboradas com a ferramenta, revisadas e aprovadas pelos autores; preços conferidos na fonte oficial do provedor</w:t>
+            </w:r>
+          </w:p>
+        </w:tc>
+        <w:tc>
+          <w:tcPr>
+            <w:tcW w:w="1645" w:type="dxa"/>
+            <w:tcMar>
+              <w:top w:w="70" w:type="dxa"/>
+              <w:left w:w="90" w:type="dxa"/>
+              <w:bottom w:w="70" w:type="dxa"/>
+              <w:right w:w="90" w:type="dxa"/>
+            </w:tcMar>
+          </w:tcPr>
+          <w:p>
+            <w:pPr>
+              <w:rPr>
+                <w:lang w:val="pt-BR"/>
+              </w:rPr>
+            </w:pPr>
+            <w:r>
+              <w:rPr>
+                <w:sz w:val="20"/>
+                <w:szCs w:val="20"/>
+                <w:lang w:val="pt-BR"/>
+              </w:rPr>
+              <w:t>10</w:t>
+            </w:r>
+            <w:r>
+              <w:rPr>
+                <w:sz w:val="20"/>
+                <w:szCs w:val="20"/>
+                <w:lang w:val="pt-BR"/>
+              </w:rPr>
+              <w:t xml:space="preserve">0% </w:t>
+            </w:r>
+            <w:r>
+              <w:rPr>
+                <w:sz w:val="20"/>
+                <w:szCs w:val="20"/>
+                <w:lang w:val="pt-BR"/>
+              </w:rPr>
+              <w:t>—</w:t>
+            </w:r>
+            <w:r>
+              <w:rPr>
+                <w:sz w:val="20"/>
+                <w:szCs w:val="20"/>
+                <w:lang w:val="pt-BR"/>
+              </w:rPr>
+              <w:t xml:space="preserve"> </w:t>
+            </w:r>
+            <w:r>
+              <w:rPr>
+                <w:sz w:val="20"/>
+                <w:szCs w:val="20"/>
+                <w:lang w:val="pt-BR"/>
+              </w:rPr>
+              <w:t xml:space="preserve">escolhas de arquitetura e dimensionamento revisadas e aprovadas pelos autores; preços conferidos na </w:t>
+            </w:r>
+            <w:r>
+              <w:rPr>
+                <w:sz w:val="20"/>
+                <w:szCs w:val="20"/>
+                <w:lang w:val="pt-BR"/>
+              </w:rPr>
+              <w:lastRenderedPageBreak/>
+              <w:t>lista oficial da AWS</w:t>
+            </w:r>
+            <w:r>
+              <w:rPr>
+                <w:sz w:val="20"/>
+                <w:szCs w:val="20"/>
+                <w:lang w:val="pt-BR"/>
+              </w:rPr>
+              <w:t xml:space="preserve"> </w:t>
+            </w:r>
+          </w:p>
+        </w:tc>
+      </w:tr>
+      <w:tr>
+        <w:tc>
+          <w:tcPr>
+            <w:tcW w:w="1693" w:type="dxa"/>
+            <w:tcMar>
+              <w:top w:w="70" w:type="dxa"/>
+              <w:left w:w="90" w:type="dxa"/>
+              <w:bottom w:w="70" w:type="dxa"/>
+              <w:right w:w="90" w:type="dxa"/>
+            </w:tcMar>
+          </w:tcPr>
+          <w:p>
+            <w:r>
+              <w:rPr>
+                <w:sz w:val="20"/>
+                <w:szCs w:val="20"/>
+              </w:rPr>
               <w:lastRenderedPageBreak/>
               <w:t>Claude Opus 5 e Claude Opus 5.5 (Anthropic)</w:t>
             </w:r>
@@ -44549,6 +45173,27 @@
             </w:tcMar>
           </w:tcPr>
           <w:p>
+            <w:r>
+              <w:rPr>
+                <w:sz w:val="20"/>
+                <w:szCs w:val="20"/>
+                <w:lang w:val="pt-BR"/>
+              </w:rPr>
+              <w:t>5.1, 5.2, 5.4 e abertura do Capítulo 6</w:t>
+            </w:r>
+          </w:p>
+        </w:tc>
+        <w:tc>
+          <w:tcPr>
+            <w:tcW w:w="2672" w:type="dxa"/>
+            <w:tcMar>
+              <w:top w:w="70" w:type="dxa"/>
+              <w:left w:w="90" w:type="dxa"/>
+              <w:bottom w:w="70" w:type="dxa"/>
+              <w:right w:w="90" w:type="dxa"/>
+            </w:tcMar>
+          </w:tcPr>
+          <w:p>
             <w:pPr>
               <w:rPr>
                 <w:lang w:val="pt-BR"/>
@@ -44560,13 +45205,13 @@
                 <w:szCs w:val="20"/>
                 <w:lang w:val="pt-BR"/>
               </w:rPr>
-              <w:t>Protótipo (repositório de código), 3.12 e 3.13</w:t>
-            </w:r>
-          </w:p>
-        </w:tc>
-        <w:tc>
-          <w:tcPr>
-            <w:tcW w:w="2672" w:type="dxa"/>
+              <w:t>Redação a partir de roteiro, interpretações e conclusões definidos pelos autores, inclusive a aceitação ou rejeição de cada hipótese; texto conferido e reescrito por eles</w:t>
+            </w:r>
+          </w:p>
+        </w:tc>
+        <w:tc>
+          <w:tcPr>
+            <w:tcW w:w="1645" w:type="dxa"/>
             <w:tcMar>
               <w:top w:w="70" w:type="dxa"/>
               <w:left w:w="90" w:type="dxa"/>
@@ -44586,41 +45231,39 @@
                 <w:szCs w:val="20"/>
                 <w:lang w:val="pt-BR"/>
               </w:rPr>
-              <w:t>Programação assistida do protótipo — serviço de decisão, interface de dados, banco, painel, firmware e testes automatizados —, sobre requisitos, arquitetura e decisões definidos pelos autores</w:t>
-            </w:r>
-          </w:p>
-        </w:tc>
-        <w:tc>
-          <w:tcPr>
-            <w:tcW w:w="1645" w:type="dxa"/>
-            <w:tcMar>
-              <w:top w:w="70" w:type="dxa"/>
-              <w:left w:w="90" w:type="dxa"/>
-              <w:bottom w:w="70" w:type="dxa"/>
-              <w:right w:w="90" w:type="dxa"/>
-            </w:tcMar>
-          </w:tcPr>
-          <w:p>
-            <w:pPr>
-              <w:rPr>
-                <w:lang w:val="pt-BR"/>
-              </w:rPr>
-            </w:pPr>
-            <w:r>
-              <w:rPr>
-                <w:sz w:val="20"/>
-                <w:szCs w:val="20"/>
-                <w:lang w:val="pt-BR"/>
-              </w:rPr>
-              <w:t>70%</w:t>
-            </w:r>
-            <w:r>
-              <w:rPr>
-                <w:sz w:val="20"/>
-                <w:szCs w:val="20"/>
-                <w:lang w:val="pt-BR"/>
-              </w:rPr>
-              <w:t xml:space="preserve"> — requisitos e arquitetura dos autores; código revisado e testado em bancada pelos autores, com montagem física e gravação do firmware feitas por eles</w:t>
+              <w:t>100%</w:t>
+            </w:r>
+            <w:r>
+              <w:rPr>
+                <w:sz w:val="20"/>
+                <w:szCs w:val="20"/>
+                <w:lang w:val="pt-BR"/>
+              </w:rPr>
+              <w:t xml:space="preserve"> </w:t>
+            </w:r>
+            <w:r>
+              <w:rPr>
+                <w:sz w:val="20"/>
+                <w:szCs w:val="20"/>
+                <w:lang w:val="pt-BR"/>
+              </w:rPr>
+              <w:t>—</w:t>
+            </w:r>
+            <w:r>
+              <w:rPr>
+                <w:sz w:val="20"/>
+                <w:szCs w:val="20"/>
+                <w:lang w:val="pt-BR"/>
+              </w:rPr>
+              <w:t xml:space="preserve"> </w:t>
+            </w:r>
+            <w:r>
+              <w:rPr>
+                <w:sz w:val="20"/>
+                <w:szCs w:val="20"/>
+                <w:lang w:val="pt-BR"/>
+              </w:rPr>
+              <w:t>julgamento de cada hipótese e conclusões definidos pelos autores; conclusão reescrita com redação própria</w:t>
             </w:r>
           </w:p>
         </w:tc>
@@ -44687,24 +45330,9 @@
               <w:rPr>
                 <w:sz w:val="20"/>
                 <w:szCs w:val="20"/>
-              </w:rPr>
-              <w:t xml:space="preserve">3.6, 3.9, 4.1, 4.6 e </w:t>
-            </w:r>
-            <w:proofErr w:type="spellStart"/>
-            <w:r>
-              <w:rPr>
-                <w:sz w:val="20"/>
-                <w:szCs w:val="20"/>
-              </w:rPr>
-              <w:t>Apêndice</w:t>
-            </w:r>
-            <w:proofErr w:type="spellEnd"/>
-            <w:r>
-              <w:rPr>
-                <w:sz w:val="20"/>
-                <w:szCs w:val="20"/>
-              </w:rPr>
-              <w:t xml:space="preserve"> B</w:t>
+                <w:lang w:val="pt-BR"/>
+              </w:rPr>
+              <w:t>Resumo e Abstract</w:t>
             </w:r>
           </w:p>
         </w:tc>
@@ -44730,7 +45358,7 @@
                 <w:szCs w:val="20"/>
                 <w:lang w:val="pt-BR"/>
               </w:rPr>
-              <w:t>Elaboração dos protocolos e dos programas de avaliação, execução dos experimentos e tabulação dos resultados, com os critérios discutidos e aprovados pelos autores antes de cada execução; busca e conferência de qualidade dos conjuntos de dados públicos</w:t>
+              <w:t>Síntese do texto dos autores e versão em inglês, conferida contra o texto em português</w:t>
             </w:r>
           </w:p>
         </w:tc>
@@ -44756,21 +45384,36 @@
                 <w:szCs w:val="20"/>
                 <w:lang w:val="pt-BR"/>
               </w:rPr>
-              <w:t>80%</w:t>
-            </w:r>
-            <w:r>
-              <w:rPr>
-                <w:sz w:val="20"/>
-                <w:szCs w:val="20"/>
-                <w:lang w:val="pt-BR"/>
-              </w:rPr>
-              <w:t xml:space="preserve"> — critérios discutidos e aprovados pelos autores antes de cada execução; resultados reinterpretados por eles (ex.: H3 rejeitada, troca para Zurique)</w:t>
+              <w:t xml:space="preserve">100% </w:t>
+            </w:r>
+            <w:r>
+              <w:rPr>
+                <w:sz w:val="20"/>
+                <w:szCs w:val="20"/>
+                <w:lang w:val="pt-BR"/>
+              </w:rPr>
+              <w:t>—</w:t>
+            </w:r>
+            <w:r>
+              <w:rPr>
+                <w:sz w:val="20"/>
+                <w:szCs w:val="20"/>
+                <w:lang w:val="pt-BR"/>
+              </w:rPr>
+              <w:t xml:space="preserve"> </w:t>
+            </w:r>
+            <w:r>
+              <w:rPr>
+                <w:sz w:val="20"/>
+                <w:szCs w:val="20"/>
+                <w:lang w:val="pt-BR"/>
+              </w:rPr>
+              <w:t>conferidos contra o texto do trabalho; Abstract conferido contra o Resumo em português</w:t>
             </w:r>
           </w:p>
         </w:tc>
       </w:tr>
       <w:tr>
-        <w:trPr/>
         <w:tc>
           <w:tcPr>
             <w:tcW w:w="1693" w:type="dxa"/>
@@ -44782,13 +45425,12 @@
             </w:tcMar>
           </w:tcPr>
           <w:p>
-            <w:pPr/>
-            <w:r>
-              <w:rPr>
-                <w:sz w:val="20"/>
-                <w:szCs w:val="20"/>
-              </w:rPr>
-              <w:t xml:space="preserve">Claude Opus 5 e Claude Opus 5.5 (Anthropic)</w:t>
+            <w:r>
+              <w:rPr>
+                <w:sz w:val="20"/>
+                <w:szCs w:val="20"/>
+              </w:rPr>
+              <w:t>Claude Opus 5 e Claude Opus 5.5 (Anthropic)</w:t>
             </w:r>
           </w:p>
         </w:tc>
@@ -44803,14 +45445,18 @@
             </w:tcMar>
           </w:tcPr>
           <w:p>
-            <w:pPr/>
-            <w:r>
-              <w:rPr>
-                <w:sz w:val="20"/>
-                <w:szCs w:val="20"/>
-                <w:lang w:val="pt-BR"/>
-              </w:rPr>
-              <w:t xml:space="preserve">claude-opus-5 e claude-opus-5-5, pela ferramenta Claude Code</w:t>
+            <w:pPr>
+              <w:rPr>
+                <w:lang w:val="pt-BR"/>
+              </w:rPr>
+            </w:pPr>
+            <w:r>
+              <w:rPr>
+                <w:sz w:val="20"/>
+                <w:szCs w:val="20"/>
+                <w:lang w:val="pt-BR"/>
+              </w:rPr>
+              <w:t>claude-opus-5 e claude-opus-5-5, pela ferramenta Claude Code</w:t>
             </w:r>
           </w:p>
         </w:tc>
@@ -44825,14 +45471,13 @@
             </w:tcMar>
           </w:tcPr>
           <w:p>
-            <w:pPr/>
-            <w:r>
-              <w:rPr>
-                <w:sz w:val="20"/>
-                <w:szCs w:val="20"/>
-                <w:lang w:val="pt-BR"/>
-              </w:rPr>
-              <w:t xml:space="preserve">3.12.1, 3.12.2, 3.12.5 e 3.12.8</w:t>
+            <w:r>
+              <w:rPr>
+                <w:sz w:val="20"/>
+                <w:szCs w:val="20"/>
+                <w:lang w:val="pt-BR"/>
+              </w:rPr>
+              <w:t>Figuras 1, 2, 6, 7, 8, 9 e 11</w:t>
             </w:r>
           </w:p>
         </w:tc>
@@ -44847,14 +45492,18 @@
             </w:tcMar>
           </w:tcPr>
           <w:p>
-            <w:pPr/>
-            <w:r>
-              <w:rPr>
-                <w:sz w:val="20"/>
-                <w:szCs w:val="20"/>
-                <w:lang w:val="pt-BR"/>
-              </w:rPr>
-              <w:t xml:space="preserve">Redação a partir de informações fornecidas pelos autores: partes interessadas, processo e divisão do trabalho, casos de uso e cronograma pelo histórico de versões do repositório</w:t>
+            <w:pPr>
+              <w:rPr>
+                <w:lang w:val="pt-BR"/>
+              </w:rPr>
+            </w:pPr>
+            <w:r>
+              <w:rPr>
+                <w:sz w:val="20"/>
+                <w:szCs w:val="20"/>
+                <w:lang w:val="pt-BR"/>
+              </w:rPr>
+              <w:t>Marcações numeradas sobre fotografias feitas pelos autores e capturas de tela do painel do protótipo</w:t>
             </w:r>
           </w:p>
         </w:tc>
@@ -44869,462 +45518,42 @@
             </w:tcMar>
           </w:tcPr>
           <w:p>
-            <w:pPr/>
-            <w:r>
-              <w:rPr>
-                <w:sz w:val="20"/>
-                <w:szCs w:val="20"/>
-                <w:lang w:val="pt-BR"/>
-              </w:rPr>
-              <w:t xml:space="preserve"/>
-            </w:r>
-          </w:p>
-        </w:tc>
-      </w:tr>
-      <w:tr>
-        <w:trPr/>
-        <w:tc>
-          <w:tcPr>
-            <w:tcW w:w="1693" w:type="dxa"/>
-            <w:tcMar>
-              <w:top w:w="70" w:type="dxa"/>
-              <w:left w:w="90" w:type="dxa"/>
-              <w:bottom w:w="70" w:type="dxa"/>
-              <w:right w:w="90" w:type="dxa"/>
-            </w:tcMar>
-          </w:tcPr>
-          <w:p>
-            <w:pPr/>
-            <w:r>
-              <w:rPr>
-                <w:sz w:val="20"/>
-                <w:szCs w:val="20"/>
-              </w:rPr>
-              <w:t xml:space="preserve">Claude Opus 5 e Claude Opus 5.5 (Anthropic)</w:t>
-            </w:r>
-          </w:p>
-        </w:tc>
-        <w:tc>
-          <w:tcPr>
-            <w:tcW w:w="1435" w:type="dxa"/>
-            <w:tcMar>
-              <w:top w:w="70" w:type="dxa"/>
-              <w:left w:w="90" w:type="dxa"/>
-              <w:bottom w:w="70" w:type="dxa"/>
-              <w:right w:w="90" w:type="dxa"/>
-            </w:tcMar>
-          </w:tcPr>
-          <w:p>
-            <w:pPr/>
-            <w:r>
-              <w:rPr>
-                <w:sz w:val="20"/>
-                <w:szCs w:val="20"/>
-                <w:lang w:val="pt-BR"/>
-              </w:rPr>
-              <w:t xml:space="preserve">claude-opus-5 e claude-opus-5-5, pela ferramenta Claude Code</w:t>
-            </w:r>
-          </w:p>
-        </w:tc>
-        <w:tc>
-          <w:tcPr>
-            <w:tcW w:w="1626" w:type="dxa"/>
-            <w:tcMar>
-              <w:top w:w="70" w:type="dxa"/>
-              <w:left w:w="90" w:type="dxa"/>
-              <w:bottom w:w="70" w:type="dxa"/>
-              <w:right w:w="90" w:type="dxa"/>
-            </w:tcMar>
-          </w:tcPr>
-          <w:p>
-            <w:pPr/>
-            <w:r>
-              <w:rPr>
-                <w:sz w:val="20"/>
-                <w:szCs w:val="20"/>
-                <w:lang w:val="pt-BR"/>
-              </w:rPr>
-              <w:t xml:space="preserve">3.12.6.4 e Apêndice D</w:t>
-            </w:r>
-          </w:p>
-        </w:tc>
-        <w:tc>
-          <w:tcPr>
-            <w:tcW w:w="2672" w:type="dxa"/>
-            <w:tcMar>
-              <w:top w:w="70" w:type="dxa"/>
-              <w:left w:w="90" w:type="dxa"/>
-              <w:bottom w:w="70" w:type="dxa"/>
-              <w:right w:w="90" w:type="dxa"/>
-            </w:tcMar>
-          </w:tcPr>
-          <w:p>
-            <w:pPr/>
-            <w:r>
-              <w:rPr>
-                <w:sz w:val="20"/>
-                <w:szCs w:val="20"/>
-                <w:lang w:val="pt-BR"/>
-              </w:rPr>
-              <w:t xml:space="preserve">Proposta de arquitetura de referência e estimativa de custo elaboradas com a ferramenta, revisadas e aprovadas pelos autores; preços conferidos na fonte oficial do provedor</w:t>
-            </w:r>
-          </w:p>
-        </w:tc>
-        <w:tc>
-          <w:tcPr>
-            <w:tcW w:w="1645" w:type="dxa"/>
-            <w:tcMar>
-              <w:top w:w="70" w:type="dxa"/>
-              <w:left w:w="90" w:type="dxa"/>
-              <w:bottom w:w="70" w:type="dxa"/>
-              <w:right w:w="90" w:type="dxa"/>
-            </w:tcMar>
-          </w:tcPr>
-          <w:p>
-            <w:pPr/>
-            <w:r>
-              <w:rPr>
-                <w:sz w:val="20"/>
-                <w:szCs w:val="20"/>
-                <w:lang w:val="pt-BR"/>
-              </w:rPr>
-              <w:t xml:space="preserve"/>
-            </w:r>
-          </w:p>
-        </w:tc>
-      </w:tr>
-      <w:tr>
-        <w:trPr/>
-        <w:tc>
-          <w:tcPr>
-            <w:tcW w:w="1693" w:type="dxa"/>
-            <w:tcMar>
-              <w:top w:w="70" w:type="dxa"/>
-              <w:left w:w="90" w:type="dxa"/>
-              <w:bottom w:w="70" w:type="dxa"/>
-              <w:right w:w="90" w:type="dxa"/>
-            </w:tcMar>
-          </w:tcPr>
-          <w:p>
-            <w:pPr/>
-            <w:r>
-              <w:rPr>
-                <w:sz w:val="20"/>
-                <w:szCs w:val="20"/>
-              </w:rPr>
-              <w:t xml:space="preserve">Claude Opus 5 e Claude Opus 5.5 (Anthropic)</w:t>
-            </w:r>
-          </w:p>
-        </w:tc>
-        <w:tc>
-          <w:tcPr>
-            <w:tcW w:w="1435" w:type="dxa"/>
-            <w:tcMar>
-              <w:top w:w="70" w:type="dxa"/>
-              <w:left w:w="90" w:type="dxa"/>
-              <w:bottom w:w="70" w:type="dxa"/>
-              <w:right w:w="90" w:type="dxa"/>
-            </w:tcMar>
-          </w:tcPr>
-          <w:p>
-            <w:pPr/>
-            <w:r>
-              <w:rPr>
-                <w:sz w:val="20"/>
-                <w:szCs w:val="20"/>
-                <w:lang w:val="pt-BR"/>
-              </w:rPr>
-              <w:t xml:space="preserve">claude-opus-5 e claude-opus-5-5, pela ferramenta Claude Code</w:t>
-            </w:r>
-          </w:p>
-        </w:tc>
-        <w:tc>
-          <w:tcPr>
-            <w:tcW w:w="1626" w:type="dxa"/>
-            <w:tcMar>
-              <w:top w:w="70" w:type="dxa"/>
-              <w:left w:w="90" w:type="dxa"/>
-              <w:bottom w:w="70" w:type="dxa"/>
-              <w:right w:w="90" w:type="dxa"/>
-            </w:tcMar>
-          </w:tcPr>
-          <w:p>
-            <w:pPr/>
-            <w:r>
-              <w:rPr>
-                <w:sz w:val="20"/>
-                <w:szCs w:val="20"/>
-                <w:lang w:val="pt-BR"/>
-              </w:rPr>
-              <w:t xml:space="preserve">5.1, 5.2, 5.4 e abertura do Capítulo 6</w:t>
-            </w:r>
-          </w:p>
-        </w:tc>
-        <w:tc>
-          <w:tcPr>
-            <w:tcW w:w="2672" w:type="dxa"/>
-            <w:tcMar>
-              <w:top w:w="70" w:type="dxa"/>
-              <w:left w:w="90" w:type="dxa"/>
-              <w:bottom w:w="70" w:type="dxa"/>
-              <w:right w:w="90" w:type="dxa"/>
-            </w:tcMar>
-          </w:tcPr>
-          <w:p>
-            <w:pPr/>
-            <w:r>
-              <w:rPr>
-                <w:sz w:val="20"/>
-                <w:szCs w:val="20"/>
-                <w:lang w:val="pt-BR"/>
-              </w:rPr>
-              <w:t xml:space="preserve">Redação a partir de roteiro, interpretações e conclusões definidos pelos autores, inclusive a aceitação ou rejeição de cada hipótese; texto conferido e reescrito por eles</w:t>
-            </w:r>
-          </w:p>
-        </w:tc>
-        <w:tc>
-          <w:tcPr>
-            <w:tcW w:w="1645" w:type="dxa"/>
-            <w:tcMar>
-              <w:top w:w="70" w:type="dxa"/>
-              <w:left w:w="90" w:type="dxa"/>
-              <w:bottom w:w="70" w:type="dxa"/>
-              <w:right w:w="90" w:type="dxa"/>
-            </w:tcMar>
-          </w:tcPr>
-          <w:p>
-            <w:pPr/>
-            <w:r>
-              <w:rPr>
-                <w:sz w:val="20"/>
-                <w:szCs w:val="20"/>
-                <w:lang w:val="pt-BR"/>
-              </w:rPr>
-              <w:t xml:space="preserve"/>
-            </w:r>
-          </w:p>
-        </w:tc>
-      </w:tr>
-      <w:tr>
-        <w:trPr/>
-        <w:tc>
-          <w:tcPr>
-            <w:tcW w:w="1693" w:type="dxa"/>
-            <w:tcMar>
-              <w:top w:w="70" w:type="dxa"/>
-              <w:left w:w="90" w:type="dxa"/>
-              <w:bottom w:w="70" w:type="dxa"/>
-              <w:right w:w="90" w:type="dxa"/>
-            </w:tcMar>
-          </w:tcPr>
-          <w:p>
-            <w:pPr/>
-            <w:r>
-              <w:rPr>
-                <w:sz w:val="20"/>
-                <w:szCs w:val="20"/>
-              </w:rPr>
-              <w:t xml:space="preserve">Claude Opus 5 e Claude Opus 5.5 (Anthropic)</w:t>
-            </w:r>
-          </w:p>
-        </w:tc>
-        <w:tc>
-          <w:tcPr>
-            <w:tcW w:w="1435" w:type="dxa"/>
-            <w:tcMar>
-              <w:top w:w="70" w:type="dxa"/>
-              <w:left w:w="90" w:type="dxa"/>
-              <w:bottom w:w="70" w:type="dxa"/>
-              <w:right w:w="90" w:type="dxa"/>
-            </w:tcMar>
-          </w:tcPr>
-          <w:p>
-            <w:pPr/>
-            <w:r>
-              <w:rPr>
-                <w:sz w:val="20"/>
-                <w:szCs w:val="20"/>
-                <w:lang w:val="pt-BR"/>
-              </w:rPr>
-              <w:t xml:space="preserve">claude-opus-5 e claude-opus-5-5, pela ferramenta Claude Code</w:t>
-            </w:r>
-          </w:p>
-        </w:tc>
-        <w:tc>
-          <w:tcPr>
-            <w:tcW w:w="1626" w:type="dxa"/>
-            <w:tcMar>
-              <w:top w:w="70" w:type="dxa"/>
-              <w:left w:w="90" w:type="dxa"/>
-              <w:bottom w:w="70" w:type="dxa"/>
-              <w:right w:w="90" w:type="dxa"/>
-            </w:tcMar>
-          </w:tcPr>
-          <w:p>
-            <w:pPr/>
-            <w:r>
-              <w:rPr>
-                <w:sz w:val="20"/>
-                <w:szCs w:val="20"/>
-                <w:lang w:val="pt-BR"/>
-              </w:rPr>
-              <w:t xml:space="preserve">Resumo e Abstract</w:t>
-            </w:r>
-          </w:p>
-        </w:tc>
-        <w:tc>
-          <w:tcPr>
-            <w:tcW w:w="2672" w:type="dxa"/>
-            <w:tcMar>
-              <w:top w:w="70" w:type="dxa"/>
-              <w:left w:w="90" w:type="dxa"/>
-              <w:bottom w:w="70" w:type="dxa"/>
-              <w:right w:w="90" w:type="dxa"/>
-            </w:tcMar>
-          </w:tcPr>
-          <w:p>
-            <w:pPr/>
-            <w:r>
-              <w:rPr>
-                <w:sz w:val="20"/>
-                <w:szCs w:val="20"/>
-                <w:lang w:val="pt-BR"/>
-              </w:rPr>
-              <w:t xml:space="preserve">Síntese do texto dos autores e versão em inglês, conferida contra o texto em português</w:t>
-            </w:r>
-          </w:p>
-        </w:tc>
-        <w:tc>
-          <w:tcPr>
-            <w:tcW w:w="1645" w:type="dxa"/>
-            <w:tcMar>
-              <w:top w:w="70" w:type="dxa"/>
-              <w:left w:w="90" w:type="dxa"/>
-              <w:bottom w:w="70" w:type="dxa"/>
-              <w:right w:w="90" w:type="dxa"/>
-            </w:tcMar>
-          </w:tcPr>
-          <w:p>
-            <w:pPr/>
-            <w:r>
-              <w:rPr>
-                <w:sz w:val="20"/>
-                <w:szCs w:val="20"/>
-                <w:lang w:val="pt-BR"/>
-              </w:rPr>
-              <w:t xml:space="preserve"/>
-            </w:r>
-          </w:p>
-        </w:tc>
-      </w:tr>
-      <w:tr>
-        <w:trPr/>
-        <w:tc>
-          <w:tcPr>
-            <w:tcW w:w="1693" w:type="dxa"/>
-            <w:tcMar>
-              <w:top w:w="70" w:type="dxa"/>
-              <w:left w:w="90" w:type="dxa"/>
-              <w:bottom w:w="70" w:type="dxa"/>
-              <w:right w:w="90" w:type="dxa"/>
-            </w:tcMar>
-          </w:tcPr>
-          <w:p>
-            <w:pPr/>
-            <w:r>
-              <w:rPr>
-                <w:sz w:val="20"/>
-                <w:szCs w:val="20"/>
-              </w:rPr>
-              <w:t xml:space="preserve">Claude Opus 5 e Claude Opus 5.5 (Anthropic)</w:t>
-            </w:r>
-          </w:p>
-        </w:tc>
-        <w:tc>
-          <w:tcPr>
-            <w:tcW w:w="1435" w:type="dxa"/>
-            <w:tcMar>
-              <w:top w:w="70" w:type="dxa"/>
-              <w:left w:w="90" w:type="dxa"/>
-              <w:bottom w:w="70" w:type="dxa"/>
-              <w:right w:w="90" w:type="dxa"/>
-            </w:tcMar>
-          </w:tcPr>
-          <w:p>
-            <w:pPr/>
-            <w:r>
-              <w:rPr>
-                <w:sz w:val="20"/>
-                <w:szCs w:val="20"/>
-                <w:lang w:val="pt-BR"/>
-              </w:rPr>
-              <w:t xml:space="preserve">claude-opus-5 e claude-opus-5-5, pela ferramenta Claude Code</w:t>
-            </w:r>
-          </w:p>
-        </w:tc>
-        <w:tc>
-          <w:tcPr>
-            <w:tcW w:w="1626" w:type="dxa"/>
-            <w:tcMar>
-              <w:top w:w="70" w:type="dxa"/>
-              <w:left w:w="90" w:type="dxa"/>
-              <w:bottom w:w="70" w:type="dxa"/>
-              <w:right w:w="90" w:type="dxa"/>
-            </w:tcMar>
-          </w:tcPr>
-          <w:p>
-            <w:pPr/>
-            <w:r>
-              <w:rPr>
-                <w:sz w:val="20"/>
-                <w:szCs w:val="20"/>
-                <w:lang w:val="pt-BR"/>
-              </w:rPr>
-              <w:t xml:space="preserve">Figuras 1, 2, 6, 7, 8, 9 e 11</w:t>
-            </w:r>
-          </w:p>
-        </w:tc>
-        <w:tc>
-          <w:tcPr>
-            <w:tcW w:w="2672" w:type="dxa"/>
-            <w:tcMar>
-              <w:top w:w="70" w:type="dxa"/>
-              <w:left w:w="90" w:type="dxa"/>
-              <w:bottom w:w="70" w:type="dxa"/>
-              <w:right w:w="90" w:type="dxa"/>
-            </w:tcMar>
-          </w:tcPr>
-          <w:p>
-            <w:pPr/>
-            <w:r>
-              <w:rPr>
-                <w:sz w:val="20"/>
-                <w:szCs w:val="20"/>
-                <w:lang w:val="pt-BR"/>
-              </w:rPr>
-              <w:t xml:space="preserve">Marcações numeradas sobre fotografias feitas pelos autores e capturas de tela do painel do protótipo</w:t>
-            </w:r>
-          </w:p>
-        </w:tc>
-        <w:tc>
-          <w:tcPr>
-            <w:tcW w:w="1645" w:type="dxa"/>
-            <w:tcMar>
-              <w:top w:w="70" w:type="dxa"/>
-              <w:left w:w="90" w:type="dxa"/>
-              <w:bottom w:w="70" w:type="dxa"/>
-              <w:right w:w="90" w:type="dxa"/>
-            </w:tcMar>
-          </w:tcPr>
-          <w:p>
-            <w:pPr/>
-            <w:r>
-              <w:rPr>
-                <w:sz w:val="20"/>
-                <w:szCs w:val="20"/>
-                <w:lang w:val="pt-BR"/>
-              </w:rPr>
-              <w:t xml:space="preserve"/>
+            <w:pPr>
+              <w:rPr>
+                <w:lang w:val="pt-BR"/>
+              </w:rPr>
+            </w:pPr>
+            <w:r>
+              <w:rPr>
+                <w:sz w:val="20"/>
+                <w:szCs w:val="20"/>
+                <w:lang w:val="pt-BR"/>
+              </w:rPr>
+              <w:t xml:space="preserve">100% </w:t>
+            </w:r>
+            <w:r>
+              <w:rPr>
+                <w:sz w:val="20"/>
+                <w:szCs w:val="20"/>
+                <w:lang w:val="pt-BR"/>
+              </w:rPr>
+              <w:t>—</w:t>
+            </w:r>
+            <w:r>
+              <w:rPr>
+                <w:sz w:val="20"/>
+                <w:szCs w:val="20"/>
+                <w:lang w:val="pt-BR"/>
+              </w:rPr>
+              <w:t xml:space="preserve"> </w:t>
+            </w:r>
+            <w:r>
+              <w:rPr>
+                <w:sz w:val="20"/>
+                <w:szCs w:val="20"/>
+                <w:lang w:val="pt-BR"/>
+              </w:rPr>
+              <w:t>fotos e capturas dos autores; posição e legenda de cada marcação conferidas na bancada</w:t>
             </w:r>
           </w:p>
         </w:tc>
@@ -45358,19 +45587,7 @@
         <w:rPr>
           <w:lang w:val="pt-BR"/>
         </w:rPr>
-        <w:t xml:space="preserve">Ambiente de acesso e janela temporal de interação. As requisições aos modelos Claude Opus 5 e Claude Opus 5.5 foram executadas pela interface do aplicativo Claude, com execução de código em ambiente isolado fornecido pela própria ferramenta, e pela ferramenta Claude Code, com execução de código no computador dos autores, no período de </w:t>
-      </w:r>
-      <w:r>
-        <w:rPr>
-          <w:lang w:val="pt-BR"/>
-        </w:rPr>
-        <w:t xml:space="preserve">13/09/2026 a 10/10/2026.</w:t>
-      </w:r>
-      <w:r>
-        <w:rPr>
-          <w:lang w:val="pt-BR"/>
-        </w:rPr>
-        <w:t xml:space="preserve"> </w:t>
+        <w:t xml:space="preserve">Ambiente de acesso e janela temporal de interação. As requisições aos modelos Claude Opus 5 e Claude Opus 5.5 foram executadas pela interface do aplicativo Claude, com execução de código em ambiente isolado fornecido pela própria ferramenta, e pela ferramenta Claude Code, com execução de código no computador dos autores, no período de 13/09/2026 a 10/10/2026. </w:t>
       </w:r>
     </w:p>
     <w:p>
@@ -45419,8 +45636,14 @@
         <w:rPr>
           <w:lang w:val="pt-BR"/>
         </w:rPr>
+        <w:t xml:space="preserve">Metodologia de refinamento. As interações empregaram contexto acumulado em sessão longa, instruções persistentes de projeto e recuperação aumentada por </w:t>
+      </w:r>
+      <w:r>
+        <w:rPr>
+          <w:lang w:val="pt-BR"/>
+        </w:rPr>
         <w:lastRenderedPageBreak/>
-        <w:t>Metodologia de refinamento. As interações empregaram contexto acumulado em sessão longa, instruções persistentes de projeto e recuperação aumentada por geração, com consulta a páginas web e a documentos carregados pelos autores — entre os quais a norma ABNT NBR 5101, os documentos contratuais do município e as orientações do professor responsável. As interações consideradas relevantes podem ser incluídas em apêndice documental, se a banca as requisitar.</w:t>
+        <w:t>geração, com consulta a páginas web e a documentos carregados pelos autores — entre os quais a norma ABNT NBR 5101, os documentos contratuais do município e as orientações do professor responsável. As interações consideradas relevantes podem ser incluídas em apêndice documental, se a banca as requisitar.</w:t>
       </w:r>
     </w:p>
     <w:p>
@@ -45619,7 +45842,6 @@
         <w:rPr>
           <w:lang w:val="pt-BR"/>
         </w:rPr>
-        <w:lastRenderedPageBreak/>
         <w:t>_______________________________________</w:t>
       </w:r>
     </w:p>
@@ -45635,6 +45857,7 @@
         <w:rPr>
           <w:lang w:val="pt-BR"/>
         </w:rPr>
+        <w:lastRenderedPageBreak/>
         <w:t>Vitor Oliveira dos Santos — RA N083DG1</w:t>
       </w:r>
     </w:p>

</xml_diff>